<commit_message>
Statspage updated mit der neuen DB Struktur
</commit_message>
<xml_diff>
--- a/ProjektplanungTypeLeague.docx
+++ b/ProjektplanungTypeLeague.docx
@@ -12,6 +12,7 @@
           <w:lang w:val="de-DE"/>
         </w:rPr>
       </w:pPr>
+      <w:proofErr w:type="spellStart"/>
       <w:r>
         <w:rPr>
           <w:b/>
@@ -22,6 +23,7 @@
         </w:rPr>
         <w:t>UserStories</w:t>
       </w:r>
+      <w:proofErr w:type="spellEnd"/>
     </w:p>
     <w:p>
       <w:pPr>
@@ -95,6 +97,7 @@
           <w:lang w:val="de-DE"/>
         </w:rPr>
       </w:pPr>
+      <w:proofErr w:type="spellStart"/>
       <w:r>
         <w:rPr>
           <w:b/>
@@ -103,7 +106,18 @@
           <w:szCs w:val="32"/>
           <w:lang w:val="de-DE"/>
         </w:rPr>
-        <w:t>TypeLeague Projekt Planung</w:t>
+        <w:t>TypeLeague</w:t>
+      </w:r>
+      <w:proofErr w:type="spellEnd"/>
+      <w:r>
+        <w:rPr>
+          <w:b/>
+          <w:bCs/>
+          <w:sz w:val="32"/>
+          <w:szCs w:val="32"/>
+          <w:lang w:val="de-DE"/>
+        </w:rPr>
+        <w:t xml:space="preserve"> Projekt Planung</w:t>
       </w:r>
     </w:p>
     <w:tbl>
@@ -1779,7 +1793,27 @@
         <w:rPr>
           <w:lang w:val="de-DE"/>
         </w:rPr>
-        <w:t>: Bcrypt</w:t>
+        <w:t xml:space="preserve">: </w:t>
+      </w:r>
+      <w:r>
+        <w:rPr>
+          <w:lang w:val="de-DE"/>
+        </w:rPr>
+        <w:t xml:space="preserve">auf </w:t>
+      </w:r>
+      <w:proofErr w:type="spellStart"/>
+      <w:r>
+        <w:rPr>
+          <w:lang w:val="de-DE"/>
+        </w:rPr>
+        <w:t>Supabase</w:t>
+      </w:r>
+      <w:proofErr w:type="spellEnd"/>
+      <w:r>
+        <w:rPr>
+          <w:lang w:val="de-DE"/>
+        </w:rPr>
+        <w:t xml:space="preserve"> </w:t>
       </w:r>
     </w:p>
     <w:p>
@@ -1865,12 +1899,14 @@
           <w:lang w:val="de-DE"/>
         </w:rPr>
       </w:pPr>
+      <w:proofErr w:type="spellStart"/>
       <w:r>
         <w:rPr>
           <w:lang w:val="de-DE"/>
         </w:rPr>
         <w:t>Leaderboard</w:t>
       </w:r>
+      <w:proofErr w:type="spellEnd"/>
     </w:p>
     <w:p>
       <w:pPr>

</xml_diff>